<commit_message>
Letzte Features eingebaut, Doku dieses mal wirklich abgeschlossen
</commit_message>
<xml_diff>
--- a/docs/Backlog.docx
+++ b/docs/Backlog.docx
@@ -26,7 +26,7 @@
         <w:rPr>
           <w:lang w:val="de-DE"/>
         </w:rPr>
-        <w:t>16 aufgeführten Aufgaben stehen im GitHub SCRUM Board auf Done. Die Aufwände wurden vom Team geprüft und bestätigt. Insgesamt ergeben sich 76 Arbeitsstunden für das Team.</w:t>
+        <w:t>19 aufgeführten Aufgaben stehen im GitHub SCRUM Board auf Done. Die Aufwände wurden vom Team geprüft und bestätigt. Insgesamt ergeben sich 86 Arbeitsstunden für das Team.</w:t>
       </w:r>
     </w:p>
     <w:p>
@@ -641,7 +641,7 @@
               <w:rPr>
                 <w:sz w:val="18"/>
               </w:rPr>
-              <w:t>—</w:t>
+              <w:t>Sprint 2</w:t>
             </w:r>
           </w:p>
         </w:tc>
@@ -1585,7 +1585,7 @@
               <w:rPr>
                 <w:sz w:val="18"/>
               </w:rPr>
-              <w:t>—</w:t>
+              <w:t>Sprint 2</w:t>
             </w:r>
           </w:p>
         </w:tc>
@@ -1702,7 +1702,7 @@
               <w:rPr>
                 <w:sz w:val="18"/>
               </w:rPr>
-              <w:t>—</w:t>
+              <w:t>Sprint 2</w:t>
             </w:r>
           </w:p>
         </w:tc>
@@ -1819,7 +1819,7 @@
               <w:rPr>
                 <w:sz w:val="18"/>
               </w:rPr>
-              <w:t>—</w:t>
+              <w:t>Sprint 2</w:t>
             </w:r>
           </w:p>
         </w:tc>
@@ -1936,7 +1936,7 @@
               <w:rPr>
                 <w:sz w:val="18"/>
               </w:rPr>
-              <w:t>—</w:t>
+              <w:t>Sprint 2</w:t>
             </w:r>
           </w:p>
         </w:tc>
@@ -2080,6 +2080,9 @@
           <w:p>
             <w:pPr>
               <w:spacing w:before="40" w:after="40"/>
+              <w:rPr>
+                <w:sz w:val="18"/>
+              </w:rPr>
             </w:pPr>
             <w:r>
               <w:rPr>
@@ -2102,6 +2105,12 @@
             <w:pPr>
               <w:spacing w:before="40" w:after="40"/>
             </w:pPr>
+            <w:r>
+              <w:rPr>
+                <w:sz w:val="18"/>
+              </w:rPr>
+              <w:t>#27</w:t>
+            </w:r>
           </w:p>
         </w:tc>
         <w:tc>
@@ -2114,6 +2123,360 @@
             </w:pPr>
             <w:r>
               <w:rPr>
+                <w:sz w:val="18"/>
+              </w:rPr>
+              <w:t>Zelltyp wechseln</w:t>
+            </w:r>
+          </w:p>
+        </w:tc>
+        <w:tc>
+          <w:tcPr>
+            <w:tcW w:w="907" w:type="dxa"/>
+          </w:tcPr>
+          <w:p>
+            <w:pPr>
+              <w:spacing w:before="40" w:after="40"/>
+            </w:pPr>
+            <w:r>
+              <w:rPr>
+                <w:sz w:val="18"/>
+              </w:rPr>
+              <w:t>2</w:t>
+            </w:r>
+          </w:p>
+        </w:tc>
+        <w:tc>
+          <w:tcPr>
+            <w:tcW w:w="1304" w:type="dxa"/>
+          </w:tcPr>
+          <w:p>
+            <w:pPr>
+              <w:spacing w:before="40" w:after="40"/>
+            </w:pPr>
+            <w:r>
+              <w:rPr>
+                <w:sz w:val="18"/>
+              </w:rPr>
+              <w:t>2</w:t>
+            </w:r>
+          </w:p>
+        </w:tc>
+        <w:tc>
+          <w:tcPr>
+            <w:tcW w:w="1134" w:type="dxa"/>
+          </w:tcPr>
+          <w:p>
+            <w:pPr>
+              <w:spacing w:before="40" w:after="40"/>
+            </w:pPr>
+            <w:r>
+              <w:rPr>
+                <w:sz w:val="18"/>
+              </w:rPr>
+              <w:t>Sprint 2</w:t>
+            </w:r>
+          </w:p>
+        </w:tc>
+        <w:tc>
+          <w:tcPr>
+            <w:tcW w:w="907" w:type="dxa"/>
+          </w:tcPr>
+          <w:p>
+            <w:pPr>
+              <w:spacing w:before="40" w:after="40"/>
+            </w:pPr>
+            <w:r>
+              <w:rPr>
+                <w:sz w:val="18"/>
+              </w:rPr>
+              <w:t>Done</w:t>
+            </w:r>
+          </w:p>
+        </w:tc>
+        <w:tc>
+          <w:tcPr>
+            <w:tcW w:w="5669" w:type="dxa"/>
+          </w:tcPr>
+          <w:p>
+            <w:pPr>
+              <w:spacing w:before="40" w:after="40"/>
+              <w:rPr>
+                <w:sz w:val="18"/>
+              </w:rPr>
+            </w:pPr>
+            <w:r>
+              <w:rPr>
+                <w:sz w:val="18"/>
+              </w:rPr>
+              <w:t>Marius</w:t>
+            </w:r>
+          </w:p>
+        </w:tc>
+      </w:tr>
+      <w:tr>
+        <w:trPr>
+          <w:cantSplit/>
+        </w:trPr>
+        <w:tc>
+          <w:tcPr>
+            <w:tcW w:w="680" w:type="dxa"/>
+          </w:tcPr>
+          <w:p>
+            <w:pPr>
+              <w:spacing w:before="40" w:after="40"/>
+            </w:pPr>
+            <w:r>
+              <w:rPr>
+                <w:sz w:val="18"/>
+              </w:rPr>
+              <w:t>#28</w:t>
+            </w:r>
+          </w:p>
+        </w:tc>
+        <w:tc>
+          <w:tcPr>
+            <w:tcW w:w="4535" w:type="dxa"/>
+          </w:tcPr>
+          <w:p>
+            <w:pPr>
+              <w:spacing w:before="40" w:after="40"/>
+            </w:pPr>
+            <w:r>
+              <w:rPr>
+                <w:sz w:val="18"/>
+              </w:rPr>
+              <w:t>Notebook Export</w:t>
+            </w:r>
+          </w:p>
+        </w:tc>
+        <w:tc>
+          <w:tcPr>
+            <w:tcW w:w="907" w:type="dxa"/>
+          </w:tcPr>
+          <w:p>
+            <w:pPr>
+              <w:spacing w:before="40" w:after="40"/>
+            </w:pPr>
+            <w:r>
+              <w:rPr>
+                <w:sz w:val="18"/>
+              </w:rPr>
+              <w:t>4</w:t>
+            </w:r>
+          </w:p>
+        </w:tc>
+        <w:tc>
+          <w:tcPr>
+            <w:tcW w:w="1304" w:type="dxa"/>
+          </w:tcPr>
+          <w:p>
+            <w:pPr>
+              <w:spacing w:before="40" w:after="40"/>
+            </w:pPr>
+            <w:r>
+              <w:rPr>
+                <w:sz w:val="18"/>
+              </w:rPr>
+              <w:t>4</w:t>
+            </w:r>
+          </w:p>
+        </w:tc>
+        <w:tc>
+          <w:tcPr>
+            <w:tcW w:w="1134" w:type="dxa"/>
+          </w:tcPr>
+          <w:p>
+            <w:pPr>
+              <w:spacing w:before="40" w:after="40"/>
+            </w:pPr>
+            <w:r>
+              <w:rPr>
+                <w:sz w:val="18"/>
+              </w:rPr>
+              <w:t>Sprint 2</w:t>
+            </w:r>
+          </w:p>
+        </w:tc>
+        <w:tc>
+          <w:tcPr>
+            <w:tcW w:w="907" w:type="dxa"/>
+          </w:tcPr>
+          <w:p>
+            <w:pPr>
+              <w:spacing w:before="40" w:after="40"/>
+            </w:pPr>
+            <w:r>
+              <w:rPr>
+                <w:sz w:val="18"/>
+              </w:rPr>
+              <w:t>Done</w:t>
+            </w:r>
+          </w:p>
+        </w:tc>
+        <w:tc>
+          <w:tcPr>
+            <w:tcW w:w="5669" w:type="dxa"/>
+          </w:tcPr>
+          <w:p>
+            <w:pPr>
+              <w:spacing w:before="40" w:after="40"/>
+              <w:rPr>
+                <w:sz w:val="18"/>
+              </w:rPr>
+            </w:pPr>
+            <w:r>
+              <w:rPr>
+                <w:sz w:val="18"/>
+              </w:rPr>
+              <w:t>Marius</w:t>
+            </w:r>
+          </w:p>
+        </w:tc>
+      </w:tr>
+      <w:tr>
+        <w:trPr>
+          <w:cantSplit/>
+        </w:trPr>
+        <w:tc>
+          <w:tcPr>
+            <w:tcW w:w="680" w:type="dxa"/>
+          </w:tcPr>
+          <w:p>
+            <w:pPr>
+              <w:spacing w:before="40" w:after="40"/>
+            </w:pPr>
+            <w:r>
+              <w:rPr>
+                <w:sz w:val="18"/>
+              </w:rPr>
+              <w:t>#29</w:t>
+            </w:r>
+          </w:p>
+        </w:tc>
+        <w:tc>
+          <w:tcPr>
+            <w:tcW w:w="4535" w:type="dxa"/>
+          </w:tcPr>
+          <w:p>
+            <w:pPr>
+              <w:spacing w:before="40" w:after="40"/>
+            </w:pPr>
+            <w:r>
+              <w:rPr>
+                <w:sz w:val="18"/>
+              </w:rPr>
+              <w:t>Zellen zusammenführen und aufteilen</w:t>
+            </w:r>
+          </w:p>
+        </w:tc>
+        <w:tc>
+          <w:tcPr>
+            <w:tcW w:w="907" w:type="dxa"/>
+          </w:tcPr>
+          <w:p>
+            <w:pPr>
+              <w:spacing w:before="40" w:after="40"/>
+            </w:pPr>
+            <w:r>
+              <w:rPr>
+                <w:sz w:val="18"/>
+              </w:rPr>
+              <w:t>5</w:t>
+            </w:r>
+          </w:p>
+        </w:tc>
+        <w:tc>
+          <w:tcPr>
+            <w:tcW w:w="1304" w:type="dxa"/>
+          </w:tcPr>
+          <w:p>
+            <w:pPr>
+              <w:spacing w:before="40" w:after="40"/>
+            </w:pPr>
+            <w:r>
+              <w:rPr>
+                <w:sz w:val="18"/>
+              </w:rPr>
+              <w:t>4</w:t>
+            </w:r>
+          </w:p>
+        </w:tc>
+        <w:tc>
+          <w:tcPr>
+            <w:tcW w:w="1134" w:type="dxa"/>
+          </w:tcPr>
+          <w:p>
+            <w:pPr>
+              <w:spacing w:before="40" w:after="40"/>
+            </w:pPr>
+            <w:r>
+              <w:rPr>
+                <w:sz w:val="18"/>
+              </w:rPr>
+              <w:t>Sprint 2</w:t>
+            </w:r>
+          </w:p>
+        </w:tc>
+        <w:tc>
+          <w:tcPr>
+            <w:tcW w:w="907" w:type="dxa"/>
+          </w:tcPr>
+          <w:p>
+            <w:pPr>
+              <w:spacing w:before="40" w:after="40"/>
+            </w:pPr>
+            <w:r>
+              <w:rPr>
+                <w:sz w:val="18"/>
+              </w:rPr>
+              <w:t>Done</w:t>
+            </w:r>
+          </w:p>
+        </w:tc>
+        <w:tc>
+          <w:tcPr>
+            <w:tcW w:w="5669" w:type="dxa"/>
+          </w:tcPr>
+          <w:p>
+            <w:pPr>
+              <w:spacing w:before="40" w:after="40"/>
+              <w:rPr>
+                <w:sz w:val="18"/>
+              </w:rPr>
+            </w:pPr>
+            <w:r>
+              <w:rPr>
+                <w:sz w:val="18"/>
+              </w:rPr>
+              <w:t>Marius</w:t>
+            </w:r>
+          </w:p>
+        </w:tc>
+      </w:tr>
+      <w:tr>
+        <w:trPr>
+          <w:cantSplit/>
+        </w:trPr>
+        <w:tc>
+          <w:tcPr>
+            <w:tcW w:w="680" w:type="dxa"/>
+          </w:tcPr>
+          <w:p>
+            <w:pPr>
+              <w:spacing w:before="40" w:after="40"/>
+            </w:pPr>
+          </w:p>
+        </w:tc>
+        <w:tc>
+          <w:tcPr>
+            <w:tcW w:w="4535" w:type="dxa"/>
+          </w:tcPr>
+          <w:p>
+            <w:pPr>
+              <w:spacing w:before="40" w:after="40"/>
+            </w:pPr>
+            <w:r>
+              <w:rPr>
                 <w:b/>
                 <w:sz w:val="18"/>
               </w:rPr>
@@ -2134,7 +2497,7 @@
                 <w:b/>
                 <w:sz w:val="18"/>
               </w:rPr>
-              <w:t>85</w:t>
+              <w:t>96</w:t>
             </w:r>
           </w:p>
         </w:tc>
@@ -2151,7 +2514,7 @@
                 <w:b/>
                 <w:sz w:val="18"/>
               </w:rPr>
-              <w:t>76</w:t>
+              <w:t>86</w:t>
             </w:r>
           </w:p>
         </w:tc>
@@ -2193,12 +2556,6 @@
           <w:lang w:val="de-DE"/>
         </w:rPr>
       </w:pPr>
-      <w:r>
-        <w:rPr>
-          <w:lang w:val="de-DE"/>
-        </w:rPr>
-        <w:br w:type="page"/>
-      </w:r>
     </w:p>
     <w:p>
       <w:pPr>
@@ -2240,7 +2597,6 @@
             <w:pPr>
               <w:spacing w:before="40" w:after="40"/>
             </w:pPr>
-            <w:proofErr w:type="spellStart"/>
             <w:r>
               <w:rPr>
                 <w:b/>
@@ -2248,7 +2604,6 @@
               </w:rPr>
               <w:t>Bereich</w:t>
             </w:r>
-            <w:proofErr w:type="spellEnd"/>
           </w:p>
         </w:tc>
         <w:tc>
@@ -2493,19 +2848,11 @@
             <w:pPr>
               <w:spacing w:before="40" w:after="40"/>
             </w:pPr>
-            <w:proofErr w:type="gramStart"/>
-            <w:r>
-              <w:rPr>
-                <w:sz w:val="18"/>
-              </w:rPr>
-              <w:t>merge, #</w:t>
-            </w:r>
-            <w:proofErr w:type="gramEnd"/>
-            <w:r>
-              <w:rPr>
-                <w:sz w:val="18"/>
-              </w:rPr>
-              <w:t>19</w:t>
+            <w:r>
+              <w:rPr>
+                <w:sz w:val="18"/>
+              </w:rPr>
+              <w:t>merge, #19</w:t>
             </w:r>
           </w:p>
         </w:tc>
@@ -2546,7 +2893,7 @@
                 <w:sz w:val="18"/>
                 <w:lang w:val="de-DE"/>
               </w:rPr>
-              <w:t>Vorgegebenen Text als neue Zelle einfügen</w:t>
+              <w:t>Text oder Inhalt einer Datei als neue Zelle einfügen</w:t>
             </w:r>
           </w:p>
         </w:tc>
@@ -2566,7 +2913,7 @@
                 <w:sz w:val="18"/>
                 <w:lang w:val="de-DE"/>
               </w:rPr>
-              <w:t>add über eine temporäre Datei, #18</w:t>
+              <w:t>Done: add im Editor oder mit Textdatei, #18</w:t>
             </w:r>
           </w:p>
         </w:tc>
@@ -2583,14 +2930,12 @@
             <w:pPr>
               <w:spacing w:before="40" w:after="40"/>
             </w:pPr>
-            <w:proofErr w:type="spellStart"/>
             <w:r>
               <w:rPr>
                 <w:sz w:val="18"/>
               </w:rPr>
               <w:t>Mittelstufe</w:t>
             </w:r>
-            <w:proofErr w:type="spellEnd"/>
           </w:p>
         </w:tc>
         <w:tc>
@@ -2629,7 +2974,7 @@
                 <w:sz w:val="18"/>
                 <w:lang w:val="de-DE"/>
               </w:rPr>
-              <w:t>Noch nicht umgesetzt; keine eigene Task im gezeigten Board</w:t>
+              <w:t>Done: type wechselt zwischen code und markdown, #27</w:t>
             </w:r>
           </w:p>
         </w:tc>
@@ -2646,14 +2991,12 @@
             <w:pPr>
               <w:spacing w:before="40" w:after="40"/>
             </w:pPr>
-            <w:proofErr w:type="spellStart"/>
             <w:r>
               <w:rPr>
                 <w:sz w:val="18"/>
               </w:rPr>
               <w:t>Mittelstufe</w:t>
             </w:r>
-            <w:proofErr w:type="spellEnd"/>
           </w:p>
         </w:tc>
         <w:tc>
@@ -2844,6 +3187,86 @@
                 <w:sz w:val="18"/>
               </w:rPr>
               <w:t>#1, #9 und #22</w:t>
+            </w:r>
+          </w:p>
+        </w:tc>
+      </w:tr>
+      <w:tr>
+        <w:tc>
+          <w:tcPr>
+            <w:tcW w:w="1701" w:type="dxa"/>
+          </w:tcPr>
+          <w:p>
+            <w:r>
+              <w:t>Fortgeschrittene</w:t>
+            </w:r>
+          </w:p>
+        </w:tc>
+        <w:tc>
+          <w:tcPr>
+            <w:tcW w:w="5102" w:type="dxa"/>
+          </w:tcPr>
+          <w:p>
+            <w:r>
+              <w:t>Notebook exportieren</w:t>
+            </w:r>
+          </w:p>
+        </w:tc>
+        <w:tc>
+          <w:tcPr>
+            <w:tcW w:w="8334" w:type="dxa"/>
+          </w:tcPr>
+          <w:p>
+            <w:pPr>
+              <w:rPr>
+                <w:lang w:val="de-DE"/>
+              </w:rPr>
+            </w:pPr>
+            <w:r>
+              <w:rPr>
+                <w:lang w:val="de-DE"/>
+              </w:rPr>
+              <w:t>Done: export als TXT, HTML und DOCX, #28</w:t>
+            </w:r>
+          </w:p>
+        </w:tc>
+      </w:tr>
+      <w:tr>
+        <w:tc>
+          <w:tcPr>
+            <w:tcW w:w="1701" w:type="dxa"/>
+          </w:tcPr>
+          <w:p>
+            <w:r>
+              <w:t>Fortgeschrittene</w:t>
+            </w:r>
+          </w:p>
+        </w:tc>
+        <w:tc>
+          <w:tcPr>
+            <w:tcW w:w="5102" w:type="dxa"/>
+          </w:tcPr>
+          <w:p>
+            <w:r>
+              <w:t>Zellen aufteilen und zusammenführen</w:t>
+            </w:r>
+          </w:p>
+        </w:tc>
+        <w:tc>
+          <w:tcPr>
+            <w:tcW w:w="8334" w:type="dxa"/>
+          </w:tcPr>
+          <w:p>
+            <w:pPr>
+              <w:rPr>
+                <w:lang w:val="de-DE"/>
+              </w:rPr>
+            </w:pPr>
+            <w:r>
+              <w:rPr>
+                <w:lang w:val="de-DE"/>
+              </w:rPr>
+              <w:t>Done: split und join, #29</w:t>
             </w:r>
           </w:p>
         </w:tc>
@@ -2859,13 +3282,7 @@
         <w:rPr>
           <w:lang w:val="de-DE"/>
         </w:rPr>
-        <w:t>Beim Einfügen wird der Text in einer temporären Notebook-Datei bearbeitet. Ein direkter Import einer beliebigen Textdatei ist nicht vorhanden. Auch das Aufteilen und Zusammenführen einzelner Zellen, automatische Umbenennen von Überschriften, Einfügen von Bildern als Base64 und Exportieren als TXT, HTML oder DOC sind bisher nicht umgesetzt</w:t>
-      </w:r>
-      <w:r>
-        <w:rPr>
-          <w:lang w:val="de-DE"/>
-        </w:rPr>
-        <w:t>.</w:t>
+        <w:t>Beim Einfügen kann der Text in einer temporären Notebook-Datei bearbeitet oder direkt aus einer Textdatei übernommen werden. Auch der Export als TXT, HTML und DOCX sowie das Aufteilen und Zusammenführen von Zellen sind umgesetzt. Das automatische Umbenennen von Überschriften und Einfügen von Bildern als Base64 sind bisher nicht umgesetzt.</w:t>
       </w:r>
     </w:p>
     <w:p>
@@ -2874,12 +3291,6 @@
           <w:lang w:val="de-DE"/>
         </w:rPr>
       </w:pPr>
-      <w:r>
-        <w:rPr>
-          <w:lang w:val="de-DE"/>
-        </w:rPr>
-        <w:br w:type="page"/>
-      </w:r>
     </w:p>
     <w:p>
       <w:pPr>
@@ -2892,7 +3303,6 @@
         <w:rPr>
           <w:lang w:val="de-DE"/>
         </w:rPr>
-        <w:lastRenderedPageBreak/>
         <w:t>Epics und User Stories</w:t>
       </w:r>
     </w:p>
@@ -2934,7 +3344,7 @@
           </w:tcPr>
           <w:p>
             <w:pPr>
-              <w:spacing w:before="60" w:after="60"/>
+              <w:spacing w:after="0"/>
             </w:pPr>
             <w:r>
               <w:rPr>
@@ -2951,7 +3361,7 @@
           </w:tcPr>
           <w:p>
             <w:pPr>
-              <w:spacing w:before="60" w:after="60"/>
+              <w:spacing w:after="0"/>
             </w:pPr>
             <w:r>
               <w:rPr>
@@ -2968,7 +3378,7 @@
           </w:tcPr>
           <w:p>
             <w:pPr>
-              <w:spacing w:before="60" w:after="60"/>
+              <w:spacing w:after="0"/>
             </w:pPr>
             <w:r>
               <w:rPr>
@@ -2985,7 +3395,7 @@
           </w:tcPr>
           <w:p>
             <w:pPr>
-              <w:spacing w:before="60" w:after="60"/>
+              <w:spacing w:after="0"/>
             </w:pPr>
             <w:r>
               <w:rPr>
@@ -3002,7 +3412,7 @@
           </w:tcPr>
           <w:p>
             <w:pPr>
-              <w:spacing w:before="60" w:after="60"/>
+              <w:spacing w:after="0"/>
             </w:pPr>
             <w:r>
               <w:rPr>
@@ -3024,7 +3434,7 @@
           </w:tcPr>
           <w:p>
             <w:pPr>
-              <w:spacing w:before="60" w:after="60"/>
+              <w:spacing w:after="0"/>
             </w:pPr>
             <w:r>
               <w:rPr>
@@ -3040,7 +3450,7 @@
           </w:tcPr>
           <w:p>
             <w:pPr>
-              <w:spacing w:before="60" w:after="60"/>
+              <w:spacing w:after="0"/>
             </w:pPr>
             <w:r>
               <w:rPr>
@@ -3056,7 +3466,7 @@
           </w:tcPr>
           <w:p>
             <w:pPr>
-              <w:spacing w:before="60" w:after="60"/>
+              <w:spacing w:after="0"/>
               <w:rPr>
                 <w:lang w:val="de-DE"/>
               </w:rPr>
@@ -3076,7 +3486,7 @@
           </w:tcPr>
           <w:p>
             <w:pPr>
-              <w:spacing w:before="60" w:after="60"/>
+              <w:spacing w:after="0"/>
               <w:rPr>
                 <w:lang w:val="de-DE"/>
               </w:rPr>
@@ -3096,30 +3506,14 @@
           </w:tcPr>
           <w:p>
             <w:pPr>
-              <w:spacing w:before="60" w:after="60"/>
-            </w:pPr>
-            <w:proofErr w:type="gramStart"/>
-            <w:r>
-              <w:rPr>
-                <w:sz w:val="18"/>
-              </w:rPr>
-              <w:t>#12, #</w:t>
-            </w:r>
-            <w:proofErr w:type="gramEnd"/>
-            <w:r>
-              <w:rPr>
-                <w:sz w:val="18"/>
-              </w:rPr>
-              <w:t xml:space="preserve">14 · </w:t>
-            </w:r>
-            <w:proofErr w:type="spellStart"/>
-            <w:r>
-              <w:rPr>
-                <w:sz w:val="18"/>
-              </w:rPr>
-              <w:t>umgesetzt</w:t>
-            </w:r>
-            <w:proofErr w:type="spellEnd"/>
+              <w:spacing w:after="0"/>
+            </w:pPr>
+            <w:r>
+              <w:rPr>
+                <w:sz w:val="18"/>
+              </w:rPr>
+              <w:t>#12, #14 · umgesetzt</w:t>
+            </w:r>
           </w:p>
         </w:tc>
       </w:tr>
@@ -3133,7 +3527,7 @@
           </w:tcPr>
           <w:p>
             <w:pPr>
-              <w:spacing w:before="60" w:after="60"/>
+              <w:spacing w:after="0"/>
             </w:pPr>
             <w:r>
               <w:rPr>
@@ -3149,7 +3543,7 @@
           </w:tcPr>
           <w:p>
             <w:pPr>
-              <w:spacing w:before="60" w:after="60"/>
+              <w:spacing w:after="0"/>
             </w:pPr>
             <w:r>
               <w:rPr>
@@ -3165,7 +3559,7 @@
           </w:tcPr>
           <w:p>
             <w:pPr>
-              <w:spacing w:before="60" w:after="60"/>
+              <w:spacing w:after="0"/>
               <w:rPr>
                 <w:lang w:val="de-DE"/>
               </w:rPr>
@@ -3185,7 +3579,7 @@
           </w:tcPr>
           <w:p>
             <w:pPr>
-              <w:spacing w:before="60" w:after="60"/>
+              <w:spacing w:after="0"/>
               <w:rPr>
                 <w:lang w:val="de-DE"/>
               </w:rPr>
@@ -3205,22 +3599,14 @@
           </w:tcPr>
           <w:p>
             <w:pPr>
-              <w:spacing w:before="60" w:after="60"/>
-            </w:pPr>
-            <w:r>
-              <w:rPr>
-                <w:sz w:val="18"/>
-              </w:rPr>
-              <w:t xml:space="preserve">#15 · </w:t>
-            </w:r>
-            <w:proofErr w:type="spellStart"/>
-            <w:r>
-              <w:rPr>
-                <w:sz w:val="18"/>
-              </w:rPr>
-              <w:t>umgesetzt</w:t>
-            </w:r>
-            <w:proofErr w:type="spellEnd"/>
+              <w:spacing w:after="0"/>
+            </w:pPr>
+            <w:r>
+              <w:rPr>
+                <w:sz w:val="18"/>
+              </w:rPr>
+              <w:t>#15 · umgesetzt</w:t>
+            </w:r>
           </w:p>
         </w:tc>
       </w:tr>
@@ -3234,7 +3620,7 @@
           </w:tcPr>
           <w:p>
             <w:pPr>
-              <w:spacing w:before="60" w:after="60"/>
+              <w:spacing w:after="0"/>
             </w:pPr>
             <w:r>
               <w:rPr>
@@ -3250,7 +3636,7 @@
           </w:tcPr>
           <w:p>
             <w:pPr>
-              <w:spacing w:before="60" w:after="60"/>
+              <w:spacing w:after="0"/>
             </w:pPr>
             <w:r>
               <w:rPr>
@@ -3266,7 +3652,7 @@
           </w:tcPr>
           <w:p>
             <w:pPr>
-              <w:spacing w:before="60" w:after="60"/>
+              <w:spacing w:after="0"/>
               <w:rPr>
                 <w:lang w:val="de-DE"/>
               </w:rPr>
@@ -3286,7 +3672,7 @@
           </w:tcPr>
           <w:p>
             <w:pPr>
-              <w:spacing w:before="60" w:after="60"/>
+              <w:spacing w:after="0"/>
               <w:rPr>
                 <w:lang w:val="de-DE"/>
               </w:rPr>
@@ -3306,30 +3692,14 @@
           </w:tcPr>
           <w:p>
             <w:pPr>
-              <w:spacing w:before="60" w:after="60"/>
-            </w:pPr>
-            <w:proofErr w:type="gramStart"/>
-            <w:r>
-              <w:rPr>
-                <w:sz w:val="18"/>
-              </w:rPr>
-              <w:t>#17, #</w:t>
-            </w:r>
-            <w:proofErr w:type="gramEnd"/>
-            <w:r>
-              <w:rPr>
-                <w:sz w:val="18"/>
-              </w:rPr>
-              <w:t xml:space="preserve">18 · </w:t>
-            </w:r>
-            <w:proofErr w:type="spellStart"/>
-            <w:r>
-              <w:rPr>
-                <w:sz w:val="18"/>
-              </w:rPr>
-              <w:t>umgesetzt</w:t>
-            </w:r>
-            <w:proofErr w:type="spellEnd"/>
+              <w:spacing w:after="0"/>
+            </w:pPr>
+            <w:r>
+              <w:rPr>
+                <w:sz w:val="18"/>
+              </w:rPr>
+              <w:t>#17, #18 · umgesetzt</w:t>
+            </w:r>
           </w:p>
         </w:tc>
       </w:tr>
@@ -3343,7 +3713,7 @@
           </w:tcPr>
           <w:p>
             <w:pPr>
-              <w:spacing w:before="60" w:after="60"/>
+              <w:spacing w:after="0"/>
             </w:pPr>
             <w:r>
               <w:rPr>
@@ -3359,7 +3729,7 @@
           </w:tcPr>
           <w:p>
             <w:pPr>
-              <w:spacing w:before="60" w:after="60"/>
+              <w:spacing w:after="0"/>
             </w:pPr>
             <w:r>
               <w:rPr>
@@ -3375,7 +3745,7 @@
           </w:tcPr>
           <w:p>
             <w:pPr>
-              <w:spacing w:before="60" w:after="60"/>
+              <w:spacing w:after="0"/>
               <w:rPr>
                 <w:lang w:val="de-DE"/>
               </w:rPr>
@@ -3395,7 +3765,7 @@
           </w:tcPr>
           <w:p>
             <w:pPr>
-              <w:spacing w:before="60" w:after="60"/>
+              <w:spacing w:after="0"/>
               <w:rPr>
                 <w:lang w:val="de-DE"/>
               </w:rPr>
@@ -3415,22 +3785,14 @@
           </w:tcPr>
           <w:p>
             <w:pPr>
-              <w:spacing w:before="60" w:after="60"/>
-            </w:pPr>
-            <w:r>
-              <w:rPr>
-                <w:sz w:val="18"/>
-              </w:rPr>
-              <w:t xml:space="preserve">#17 · </w:t>
-            </w:r>
-            <w:proofErr w:type="spellStart"/>
-            <w:r>
-              <w:rPr>
-                <w:sz w:val="18"/>
-              </w:rPr>
-              <w:t>umgesetzt</w:t>
-            </w:r>
-            <w:proofErr w:type="spellEnd"/>
+              <w:spacing w:after="0"/>
+            </w:pPr>
+            <w:r>
+              <w:rPr>
+                <w:sz w:val="18"/>
+              </w:rPr>
+              <w:t>#17 · umgesetzt</w:t>
+            </w:r>
           </w:p>
         </w:tc>
       </w:tr>
@@ -3444,7 +3806,7 @@
           </w:tcPr>
           <w:p>
             <w:pPr>
-              <w:spacing w:before="60" w:after="60"/>
+              <w:spacing w:after="0"/>
             </w:pPr>
             <w:r>
               <w:rPr>
@@ -3460,7 +3822,7 @@
           </w:tcPr>
           <w:p>
             <w:pPr>
-              <w:spacing w:before="60" w:after="60"/>
+              <w:spacing w:after="0"/>
             </w:pPr>
             <w:r>
               <w:rPr>
@@ -3476,7 +3838,7 @@
           </w:tcPr>
           <w:p>
             <w:pPr>
-              <w:spacing w:before="60" w:after="60"/>
+              <w:spacing w:after="0"/>
               <w:rPr>
                 <w:lang w:val="de-DE"/>
               </w:rPr>
@@ -3496,7 +3858,7 @@
           </w:tcPr>
           <w:p>
             <w:pPr>
-              <w:spacing w:before="60" w:after="60"/>
+              <w:spacing w:after="0"/>
               <w:rPr>
                 <w:lang w:val="de-DE"/>
               </w:rPr>
@@ -3516,22 +3878,14 @@
           </w:tcPr>
           <w:p>
             <w:pPr>
-              <w:spacing w:before="60" w:after="60"/>
-            </w:pPr>
-            <w:r>
-              <w:rPr>
-                <w:sz w:val="18"/>
-              </w:rPr>
-              <w:t xml:space="preserve">#20 · </w:t>
-            </w:r>
-            <w:proofErr w:type="spellStart"/>
-            <w:r>
-              <w:rPr>
-                <w:sz w:val="18"/>
-              </w:rPr>
-              <w:t>umgesetzt</w:t>
-            </w:r>
-            <w:proofErr w:type="spellEnd"/>
+              <w:spacing w:after="0"/>
+            </w:pPr>
+            <w:r>
+              <w:rPr>
+                <w:sz w:val="18"/>
+              </w:rPr>
+              <w:t>#20 · umgesetzt</w:t>
+            </w:r>
           </w:p>
         </w:tc>
       </w:tr>
@@ -3545,12 +3899,13 @@
           </w:tcPr>
           <w:p>
             <w:pPr>
-              <w:spacing w:before="60" w:after="60"/>
-            </w:pPr>
-            <w:r>
-              <w:rPr>
-                <w:sz w:val="18"/>
-              </w:rPr>
+              <w:spacing w:after="0"/>
+            </w:pPr>
+            <w:r>
+              <w:rPr>
+                <w:sz w:val="18"/>
+              </w:rPr>
+              <w:lastRenderedPageBreak/>
               <w:t>E2 Zellen bearbeiten</w:t>
             </w:r>
           </w:p>
@@ -3561,7 +3916,7 @@
           </w:tcPr>
           <w:p>
             <w:pPr>
-              <w:spacing w:before="60" w:after="60"/>
+              <w:spacing w:after="0"/>
             </w:pPr>
             <w:r>
               <w:rPr>
@@ -3577,7 +3932,7 @@
           </w:tcPr>
           <w:p>
             <w:pPr>
-              <w:spacing w:before="60" w:after="60"/>
+              <w:spacing w:after="0"/>
               <w:rPr>
                 <w:lang w:val="de-DE"/>
               </w:rPr>
@@ -3597,7 +3952,7 @@
           </w:tcPr>
           <w:p>
             <w:pPr>
-              <w:spacing w:before="60" w:after="60"/>
+              <w:spacing w:after="0"/>
               <w:rPr>
                 <w:lang w:val="de-DE"/>
               </w:rPr>
@@ -3617,7 +3972,7 @@
           </w:tcPr>
           <w:p>
             <w:pPr>
-              <w:spacing w:before="60" w:after="60"/>
+              <w:spacing w:after="0"/>
               <w:rPr>
                 <w:lang w:val="de-DE"/>
               </w:rPr>
@@ -3627,7 +3982,7 @@
                 <w:sz w:val="18"/>
                 <w:lang w:val="de-DE"/>
               </w:rPr>
-              <w:t>Noch offen · keine eigene Task</w:t>
+              <w:t>Done: type · #27</w:t>
             </w:r>
           </w:p>
         </w:tc>
@@ -3642,7 +3997,7 @@
           </w:tcPr>
           <w:p>
             <w:pPr>
-              <w:spacing w:before="60" w:after="60"/>
+              <w:spacing w:after="0"/>
               <w:rPr>
                 <w:lang w:val="de-DE"/>
               </w:rPr>
@@ -3662,7 +4017,7 @@
           </w:tcPr>
           <w:p>
             <w:pPr>
-              <w:spacing w:before="60" w:after="60"/>
+              <w:spacing w:after="0"/>
             </w:pPr>
             <w:r>
               <w:rPr>
@@ -3678,7 +4033,7 @@
           </w:tcPr>
           <w:p>
             <w:pPr>
-              <w:spacing w:before="60" w:after="60"/>
+              <w:spacing w:after="0"/>
               <w:rPr>
                 <w:lang w:val="de-DE"/>
               </w:rPr>
@@ -3698,7 +4053,7 @@
           </w:tcPr>
           <w:p>
             <w:pPr>
-              <w:spacing w:before="60" w:after="60"/>
+              <w:spacing w:after="0"/>
               <w:rPr>
                 <w:lang w:val="de-DE"/>
               </w:rPr>
@@ -3718,22 +4073,14 @@
           </w:tcPr>
           <w:p>
             <w:pPr>
-              <w:spacing w:before="60" w:after="60"/>
-            </w:pPr>
-            <w:r>
-              <w:rPr>
-                <w:sz w:val="18"/>
-              </w:rPr>
-              <w:t xml:space="preserve">#19 · </w:t>
-            </w:r>
-            <w:proofErr w:type="spellStart"/>
-            <w:r>
-              <w:rPr>
-                <w:sz w:val="18"/>
-              </w:rPr>
-              <w:t>umgesetzt</w:t>
-            </w:r>
-            <w:proofErr w:type="spellEnd"/>
+              <w:spacing w:after="0"/>
+            </w:pPr>
+            <w:r>
+              <w:rPr>
+                <w:sz w:val="18"/>
+              </w:rPr>
+              <w:t>#19 · umgesetzt</w:t>
+            </w:r>
           </w:p>
         </w:tc>
       </w:tr>
@@ -3747,7 +4094,7 @@
           </w:tcPr>
           <w:p>
             <w:pPr>
-              <w:spacing w:before="60" w:after="60"/>
+              <w:spacing w:after="0"/>
               <w:rPr>
                 <w:lang w:val="de-DE"/>
               </w:rPr>
@@ -3767,7 +4114,7 @@
           </w:tcPr>
           <w:p>
             <w:pPr>
-              <w:spacing w:before="60" w:after="60"/>
+              <w:spacing w:after="0"/>
             </w:pPr>
             <w:r>
               <w:rPr>
@@ -3783,7 +4130,7 @@
           </w:tcPr>
           <w:p>
             <w:pPr>
-              <w:spacing w:before="60" w:after="60"/>
+              <w:spacing w:after="0"/>
               <w:rPr>
                 <w:lang w:val="de-DE"/>
               </w:rPr>
@@ -3803,7 +4150,7 @@
           </w:tcPr>
           <w:p>
             <w:pPr>
-              <w:spacing w:before="60" w:after="60"/>
+              <w:spacing w:after="0"/>
               <w:rPr>
                 <w:lang w:val="de-DE"/>
               </w:rPr>
@@ -3823,22 +4170,14 @@
           </w:tcPr>
           <w:p>
             <w:pPr>
-              <w:spacing w:before="60" w:after="60"/>
-            </w:pPr>
-            <w:r>
-              <w:rPr>
-                <w:sz w:val="18"/>
-              </w:rPr>
-              <w:t xml:space="preserve">#16 · </w:t>
-            </w:r>
-            <w:proofErr w:type="spellStart"/>
-            <w:r>
-              <w:rPr>
-                <w:sz w:val="18"/>
-              </w:rPr>
-              <w:t>umgesetzt</w:t>
-            </w:r>
-            <w:proofErr w:type="spellEnd"/>
+              <w:spacing w:after="0"/>
+            </w:pPr>
+            <w:r>
+              <w:rPr>
+                <w:sz w:val="18"/>
+              </w:rPr>
+              <w:t>#16 · umgesetzt</w:t>
+            </w:r>
           </w:p>
         </w:tc>
       </w:tr>
@@ -3859,15 +4198,10 @@
     <w:p>
       <w:pPr>
         <w:pStyle w:val="Heading1"/>
-        <w:rPr>
-          <w:lang w:val="de-DE"/>
-        </w:rPr>
+        <w:spacing w:before="120" w:after="60"/>
       </w:pPr>
       <w:r>
-        <w:rPr>
-          <w:lang w:val="de-DE"/>
-        </w:rPr>
-        <w:t>Geplant aber nicht umgesetzt in der Projektzeit</w:t>
+        <w:t>Done</w:t>
       </w:r>
     </w:p>
     <w:p>
@@ -3881,7 +4215,7 @@
         <w:rPr>
           <w:lang w:val="de-DE"/>
         </w:rPr>
-        <w:t>Den Typ einer vorhandenen Zelle zwischen code und markdown ändern (US6).</w:t>
+        <w:t>Inhalt einer Textdatei mit add als neue Zelle importieren.</w:t>
       </w:r>
     </w:p>
     <w:p>
@@ -3895,7 +4229,7 @@
         <w:rPr>
           <w:lang w:val="de-DE"/>
         </w:rPr>
-        <w:t>Den Inhalt einer vorhandenen Textdatei direkt als neue Zelle importieren. Vorgegebener Text kann bereits über die temporäre Datei bei add eingefügt werden.</w:t>
+        <w:t>Notebook mit export als TXT, HTML oder DOCX exportieren. DOCX wird anstelle des älteren DOC-Formats verwendet.</w:t>
       </w:r>
     </w:p>
     <w:p>
@@ -3909,7 +4243,36 @@
         <w:rPr>
           <w:lang w:val="de-DE"/>
         </w:rPr>
-        <w:t>Eine Zelle in mehrere Zellen aufteilen oder mehrere Zellen innerhalb eines Notebooks zusammenführen.</w:t>
+        <w:t>Typ einer vorhandenen Zelle mit type zwischen code und markdown ändern (US6).</w:t>
+      </w:r>
+    </w:p>
+    <w:p>
+      <w:pPr>
+        <w:pStyle w:val="ListBullet"/>
+        <w:rPr>
+          <w:lang w:val="de-DE"/>
+        </w:rPr>
+      </w:pPr>
+      <w:r>
+        <w:rPr>
+          <w:lang w:val="de-DE"/>
+        </w:rPr>
+        <w:t>Zellen mit split nach einer Textzeile aufteilen und mit join zusammenführen. Die ausgewählten Zellen dürfen auch nicht nebeneinander stehen; ihr Typ muss übereinstimmen.</w:t>
+      </w:r>
+    </w:p>
+    <w:p>
+      <w:pPr>
+        <w:pStyle w:val="Heading1"/>
+        <w:spacing w:before="120" w:after="60"/>
+        <w:rPr>
+          <w:lang w:val="de-DE"/>
+        </w:rPr>
+      </w:pPr>
+      <w:r>
+        <w:rPr>
+          <w:lang w:val="de-DE"/>
+        </w:rPr>
+        <w:t>Geplant aber nicht umgesetzt in der Projektzeit</w:t>
       </w:r>
     </w:p>
     <w:p>
@@ -3938,20 +4301,6 @@
           <w:lang w:val="de-DE"/>
         </w:rPr>
         <w:t>Ein Bild als Base64 codieren und in das Notebook einbetten.</w:t>
-      </w:r>
-    </w:p>
-    <w:p>
-      <w:pPr>
-        <w:pStyle w:val="ListBullet"/>
-        <w:rPr>
-          <w:lang w:val="de-DE"/>
-        </w:rPr>
-      </w:pPr>
-      <w:r>
-        <w:rPr>
-          <w:lang w:val="de-DE"/>
-        </w:rPr>
-        <w:t>Ein Notebook als TXT, HTML oder DOC exportieren.</w:t>
       </w:r>
     </w:p>
     <w:sectPr>

</xml_diff>